<commit_message>
Clarify family communication workflow
</commit_message>
<xml_diff>
--- a/STARLAB_Unit_1/Appendixes/Appendix_J_Optional_Initial_Parent_or_Guardian_Communication.docx
+++ b/STARLAB_Unit_1/Appendixes/Appendix_J_Optional_Initial_Parent_or_Guardian_Communication.docx
@@ -34,10 +34,7 @@
         <w:rPr/>
       </w:pPr>
       <w:r>
-        <w:rPr>
-          <w:rtl w:val="0"/>
-        </w:rPr>
-        <w:t xml:space="preserve">Teachers may choose to send a brief message home early in the course.</w:t>
+        <w:t>Teachers may choose to send this brief message before the course or during Week 1. It is the shortened launch option; use the STARLAB Parent/Guardian Communication Pack as the primary coursewide source for later approval, progress, reporting, showcase, and closure messages. Customize and distribute through a district-approved channel. This message does not replace district permission, consent, media-release, fieldwork, transportation, safety, or data-privacy forms.</w:t>
       </w:r>
     </w:p>
     <w:p>

</xml_diff>